<commit_message>
modified:   "PRD/\353\266\204\354\213\244\353\254\274_\352\262\200\354\266\234_\353\254\264\354\235\270\354\235\264\353\217\231\354\262\264_PRD.docx" 	modified:   index.html 	new file:   "report/nooki_\352\260\235\354\262\264\354\235\270\354\213\235_\353\252\250\353\215\270_\354\266\224\354\262\234_\353\263\264\352\263\240\354\204\234.docx" 	new file:   report/tools/polish_report_docx.py
</commit_message>
<xml_diff>
--- a/PRD/분실물_검출_무인이동체_PRD.docx
+++ b/PRD/분실물_검출_무인이동체_PRD.docx
@@ -1029,7 +1029,7 @@
                 <w:sz w:val="19"/>
                 <w:szCs w:val="19"/>
               </w:rPr>
-              <w:t xml:space="preserve">Jetson Orin Nano 또는 Raspberry Pi 5 + AI 가속기</w:t>
+              <w:t xml:space="preserve">Raspberry Pi 5 (8GB) + AI HAT+ 13 TOPS (Hailo-8L), 액티브 쿨러</w:t>
             </w:r>
           </w:p>
         </w:tc>
@@ -1059,7 +1059,7 @@
                 <w:sz w:val="19"/>
                 <w:szCs w:val="19"/>
               </w:rPr>
-              <w:t xml:space="preserve">YOLO를 실시간(10fps 이상)으로 돌리기 위한 GPU/NPU</w:t>
+              <w:t xml:space="preserve">YOLO는 NPU에서 실시간(10fps 이상)으로, 전처리는 CPU·카메라 ISP에서 처리</w:t>
             </w:r>
           </w:p>
         </w:tc>
@@ -1127,7 +1127,7 @@
                 <w:sz w:val="19"/>
                 <w:szCs w:val="19"/>
               </w:rPr>
-              <w:t xml:space="preserve">광각 RGB 카메라 1대, 바닥 가까이 장착</w:t>
+              <w:t xml:space="preserve">Camera Module 3 Wide(수평 102°) 1대, 바닥 가까이 장착</w:t>
             </w:r>
           </w:p>
         </w:tc>
@@ -1421,7 +1421,7 @@
                 <w:sz w:val="19"/>
                 <w:szCs w:val="19"/>
               </w:rPr>
-              <w:t xml:space="preserve">PWM 밝기 조절 LED (카메라 방향)</w:t>
+              <w:t xml:space="preserve">PWM 밝기 조절 LED (카메라 방향, RP1 하드웨어 PWM 20kHz 이상)</w:t>
             </w:r>
           </w:p>
         </w:tc>
@@ -1754,7 +1754,7 @@
                 <w:sz w:val="19"/>
                 <w:szCs w:val="19"/>
               </w:rPr>
-              <w:t xml:space="preserve">ROS 2 (Humble/Jazzy)</w:t>
+              <w:t xml:space="preserve">ROS 2 Jazzy (Raspberry Pi OS에서는 Docker로 실행)</w:t>
             </w:r>
           </w:p>
         </w:tc>
@@ -1882,7 +1882,7 @@
                 <w:sz w:val="19"/>
                 <w:szCs w:val="19"/>
               </w:rPr>
-              <w:t xml:space="preserve">에어팟·반지·귀걸이 등 대상 물품으로 파인튜닝, TensorRT/ONNX INT8로 변환해 엣지 가속</w:t>
+              <w:t xml:space="preserve">에어팟·반지·귀걸이 등 대상 물품으로 파인튜닝, ONNX → Hailo DFC로 INT8 HEF 컴파일해 NPU 가속</w:t>
             </w:r>
           </w:p>
         </w:tc>
@@ -2146,7 +2146,7 @@
                 <w:sz w:val="19"/>
                 <w:szCs w:val="19"/>
               </w:rPr>
-              <w:t xml:space="preserve">OpenCV</w:t>
+              <w:t xml:space="preserve">Picamera2 + OpenCV</w:t>
             </w:r>
           </w:p>
         </w:tc>
@@ -2176,7 +2176,7 @@
                 <w:sz w:val="19"/>
                 <w:szCs w:val="19"/>
               </w:rPr>
-              <w:t xml:space="preserve">프레임 평균 밝기·히스토그램으로 어두움 판단 → LED 점등, 필요 시 CLAHE로 대비 보정</w:t>
+              <w:t xml:space="preserve">카메라 메타데이터(노출 시간 × 게인)로 어두움 판단 → LED 점등, ISP 노이즈 제거, CLAHE로 대비 보정</w:t>
             </w:r>
           </w:p>
         </w:tc>
@@ -2538,7 +2538,7 @@
                 <w:sz w:val="19"/>
                 <w:szCs w:val="19"/>
               </w:rPr>
-              <w:t xml:space="preserve">오프라인 STT (Whisper 경량 모델 등)</w:t>
+              <w:t xml:space="preserve">오프라인 STT (whisper.cpp 경량 모델 등, 탐색 중에는 정지해 CPU 확보)</w:t>
             </w:r>
           </w:p>
         </w:tc>
@@ -2729,7 +2729,7 @@
         <w:rPr>
           <w:rFonts w:ascii="맑은 고딕" w:cs="맑은 고딕" w:eastAsia="맑은 고딕" w:hAnsi="맑은 고딕"/>
         </w:rPr>
-        <w:t xml:space="preserve">이동 중 OpenCV가 밝기를 살피고, 어두우면 LED를 켭니다.</w:t>
+        <w:t xml:space="preserve">이동 중 카메라 노출·게인 값으로 밝기를 살피고, 어두우면 LED를 켭니다.</w:t>
       </w:r>
     </w:p>
     <w:p>

</xml_diff>